<commit_message>
Update License to Publish form for camera-ready authors
Co-authored-by: Cursor <cursoragent@cursor.com>
</commit_message>
<xml_diff>
--- a/SNCS_ProceedingsPaper_LTP_ST_SN_Switzerland.docx
+++ b/SNCS_ProceedingsPaper_LTP_ST_SN_Switzerland.docx
@@ -1,6 +1,6 @@
 
 <file path=word/document.xml><?xml version="1.0" encoding="utf-8"?>
-<w:document xmlns:wpc="http://schemas.microsoft.com/office/word/2010/wordprocessingCanvas" xmlns:cx="http://schemas.microsoft.com/office/drawing/2014/chartex" xmlns:cx1="http://schemas.microsoft.com/office/drawing/2015/9/8/chartex" xmlns:cx2="http://schemas.microsoft.com/office/drawing/2015/10/21/chartex" xmlns:cx3="http://schemas.microsoft.com/office/drawing/2016/5/9/chartex" xmlns:cx4="http://schemas.microsoft.com/office/drawing/2016/5/10/chartex" xmlns:cx5="http://schemas.microsoft.com/office/drawing/2016/5/11/chartex" xmlns:cx6="http://schemas.microsoft.com/office/drawing/2016/5/12/chartex" xmlns:cx7="http://schemas.microsoft.com/office/drawing/2016/5/13/chartex" xmlns:cx8="http://schemas.microsoft.com/office/drawing/2016/5/14/chartex" xmlns:mc="http://schemas.openxmlformats.org/markup-compatibility/2006" xmlns:aink="http://schemas.microsoft.com/office/drawing/2016/ink" xmlns:am3d="http://schemas.microsoft.com/office/drawing/2017/model3d" xmlns:o="urn:schemas-microsoft-com:office:office" xmlns:oel="http://schemas.microsoft.com/office/2019/extlst" xmlns:r="http://schemas.openxmlformats.org/officeDocument/2006/relationships" xmlns:m="http://schemas.openxmlformats.org/officeDocument/2006/math" xmlns:v="urn:schemas-microsoft-com:vml" xmlns:wp14="http://schemas.microsoft.com/office/word/2010/wordprocessingDrawing" xmlns:wp="http://schemas.openxmlformats.org/drawingml/2006/wordprocessingDrawing" xmlns:w10="urn:schemas-microsoft-com:office:word" xmlns:w="http://schemas.openxmlformats.org/wordprocessingml/2006/main" xmlns:w14="http://schemas.microsoft.com/office/word/2010/wordml" xmlns:w15="http://schemas.microsoft.com/office/word/2012/wordml" xmlns:w16cei="http://schemas.microsoft.com/office/word/2026/wordml/cei" xmlns:w16cex="http://schemas.microsoft.com/office/word/2018/wordml/cex" xmlns:w16cid="http://schemas.microsoft.com/office/word/2016/wordml/cid" xmlns:w16="http://schemas.microsoft.com/office/word/2018/wordml" xmlns:w16du="http://schemas.microsoft.com/office/word/2023/wordml/word16du" xmlns:w16sdtdh="http://schemas.microsoft.com/office/word/2020/wordml/sdtdatahash" xmlns:w16sdtfl="http://schemas.microsoft.com/office/word/2024/wordml/sdtformatlock" xmlns:w16se="http://schemas.microsoft.com/office/word/2015/wordml/symex" xmlns:wpg="http://schemas.microsoft.com/office/word/2010/wordprocessingGroup" xmlns:wpi="http://schemas.microsoft.com/office/word/2010/wordprocessingInk" xmlns:wne="http://schemas.microsoft.com/office/word/2006/wordml" xmlns:wps="http://schemas.microsoft.com/office/word/2010/wordprocessingShape" mc:Ignorable="w14 w15 w16se w16cid w16 w16cex w16sdtdh w16sdtfl w16du wp14">
+<w:document xmlns:wpc="http://schemas.microsoft.com/office/word/2010/wordprocessingCanvas" xmlns:cx="http://schemas.microsoft.com/office/drawing/2014/chartex" xmlns:cx1="http://schemas.microsoft.com/office/drawing/2015/9/8/chartex" xmlns:cx2="http://schemas.microsoft.com/office/drawing/2015/10/21/chartex" xmlns:cx3="http://schemas.microsoft.com/office/drawing/2016/5/9/chartex" xmlns:cx4="http://schemas.microsoft.com/office/drawing/2016/5/10/chartex" xmlns:cx5="http://schemas.microsoft.com/office/drawing/2016/5/11/chartex" xmlns:cx6="http://schemas.microsoft.com/office/drawing/2016/5/12/chartex" xmlns:cx7="http://schemas.microsoft.com/office/drawing/2016/5/13/chartex" xmlns:cx8="http://schemas.microsoft.com/office/drawing/2016/5/14/chartex" xmlns:mc="http://schemas.openxmlformats.org/markup-compatibility/2006" xmlns:aink="http://schemas.microsoft.com/office/drawing/2016/ink" xmlns:am3d="http://schemas.microsoft.com/office/drawing/2017/model3d" xmlns:o="urn:schemas-microsoft-com:office:office" xmlns:oel="http://schemas.microsoft.com/office/2019/extlst" xmlns:r="http://schemas.openxmlformats.org/officeDocument/2006/relationships" xmlns:m="http://schemas.openxmlformats.org/officeDocument/2006/math" xmlns:v="urn:schemas-microsoft-com:vml" xmlns:wp14="http://schemas.microsoft.com/office/word/2010/wordprocessingDrawing" xmlns:wp="http://schemas.openxmlformats.org/drawingml/2006/wordprocessingDrawing" xmlns:w10="urn:schemas-microsoft-com:office:word" xmlns:w="http://schemas.openxmlformats.org/wordprocessingml/2006/main" xmlns:w14="http://schemas.microsoft.com/office/word/2010/wordml" xmlns:w15="http://schemas.microsoft.com/office/word/2012/wordml" xmlns:w16cex="http://schemas.microsoft.com/office/word/2018/wordml/cex" xmlns:w16cid="http://schemas.microsoft.com/office/word/2016/wordml/cid" xmlns:w16="http://schemas.microsoft.com/office/word/2018/wordml" xmlns:w16du="http://schemas.microsoft.com/office/word/2023/wordml/word16du" xmlns:w16sdtdh="http://schemas.microsoft.com/office/word/2020/wordml/sdtdatahash" xmlns:w16sdtfl="http://schemas.microsoft.com/office/word/2024/wordml/sdtformatlock" xmlns:w16se="http://schemas.microsoft.com/office/word/2015/wordml/symex" xmlns:wpg="http://schemas.microsoft.com/office/word/2010/wordprocessingGroup" xmlns:wpi="http://schemas.microsoft.com/office/word/2010/wordprocessingInk" xmlns:wne="http://schemas.microsoft.com/office/word/2006/wordml" xmlns:wps="http://schemas.microsoft.com/office/word/2010/wordprocessingShape" mc:Ignorable="w14 w15 w16se w16cid w16 w16cex w16sdtdh w16sdtfl w16du wp14">
   <w:body>
     <w:tbl>
       <w:tblPr>
@@ -363,39 +363,13 @@
                     <w:szCs w:val="16"/>
                   </w:rPr>
                 </w:pPr>
-                <w:proofErr w:type="spellStart"/>
                 <w:r>
                   <w:rPr>
                     <w:rFonts w:eastAsia="Cambria" w:cstheme="minorHAnsi"/>
                     <w:sz w:val="16"/>
                     <w:szCs w:val="16"/>
                   </w:rPr>
-                  <w:t>CLiMeM</w:t>
-                </w:r>
-                <w:proofErr w:type="spellEnd"/>
-                <w:r>
-                  <w:rPr>
-                    <w:rFonts w:eastAsia="Cambria" w:cstheme="minorHAnsi"/>
-                    <w:sz w:val="16"/>
-                    <w:szCs w:val="16"/>
-                  </w:rPr>
-                  <w:t xml:space="preserve">: </w:t>
-                </w:r>
-                <w:r>
-                  <w:rPr>
-                    <w:rFonts w:eastAsia="Cambria" w:cstheme="minorHAnsi"/>
-                    <w:sz w:val="16"/>
-                    <w:szCs w:val="16"/>
-                  </w:rPr>
-                  <w:t>Continual Learning in Medical Multimodal-Vision</w:t>
-                </w:r>
-                <w:r>
-                  <w:rPr>
-                    <w:rFonts w:eastAsia="Cambria" w:cstheme="minorHAnsi"/>
-                    <w:sz w:val="16"/>
-                    <w:szCs w:val="16"/>
-                  </w:rPr>
-                  <w:t xml:space="preserve"> – MICCAI 2026</w:t>
+                  <w:t>Medical Image Computing and Computer Assisted Intervention – MICCAI 2026 Satellite Events</w:t>
                 </w:r>
               </w:p>
             </w:tc>
@@ -541,7 +515,51 @@
                     <w:sz w:val="16"/>
                     <w:szCs w:val="16"/>
                   </w:rPr>
-                  <w:t xml:space="preserve">Reza Hamidpour, Nourhan Bayasi </w:t>
+                  <w:t xml:space="preserve">Spyridon Bakas, Ghada </w:t>
+                </w:r>
+                <w:proofErr w:type="spellStart"/>
+                <w:r>
+                  <w:rPr>
+                    <w:rFonts w:eastAsia="Cambria" w:cstheme="minorHAnsi"/>
+                    <w:sz w:val="16"/>
+                    <w:szCs w:val="16"/>
+                  </w:rPr>
+                  <w:t>Zamzmi</w:t>
+                </w:r>
+                <w:proofErr w:type="spellEnd"/>
+                <w:r>
+                  <w:rPr>
+                    <w:rFonts w:eastAsia="Cambria" w:cstheme="minorHAnsi"/>
+                    <w:sz w:val="16"/>
+                    <w:szCs w:val="16"/>
+                  </w:rPr>
+                  <w:t xml:space="preserve">, </w:t>
+                </w:r>
+                <w:proofErr w:type="spellStart"/>
+                <w:r>
+                  <w:rPr>
+                    <w:rFonts w:eastAsia="Cambria" w:cstheme="minorHAnsi"/>
+                    <w:sz w:val="16"/>
+                    <w:szCs w:val="16"/>
+                  </w:rPr>
+                  <w:t>Xiaoxiao</w:t>
+                </w:r>
+                <w:proofErr w:type="spellEnd"/>
+                <w:r>
+                  <w:rPr>
+                    <w:rFonts w:eastAsia="Cambria" w:cstheme="minorHAnsi"/>
+                    <w:sz w:val="16"/>
+                    <w:szCs w:val="16"/>
+                  </w:rPr>
+                  <w:t xml:space="preserve"> Li, et a</w:t>
+                </w:r>
+                <w:r>
+                  <w:rPr>
+                    <w:rFonts w:eastAsia="Cambria" w:cstheme="minorHAnsi"/>
+                    <w:sz w:val="16"/>
+                    <w:szCs w:val="16"/>
+                  </w:rPr>
+                  <w:t>l.</w:t>
                 </w:r>
               </w:p>
             </w:tc>
@@ -4436,7 +4454,7 @@
               </wp:anchor>
             </w:drawing>
           </mc:Choice>
-          <mc:Fallback>
+          <mc:Fallback xmlns:w16cei="http://schemas.microsoft.com/office/word/2026/wordml/cei">
             <w:pict>
               <v:line id="Straight Connector 2" o:spid="_x0000_s1025" style="mso-wrap-distance-bottom:0;mso-wrap-distance-left:9pt;mso-wrap-distance-right:9pt;mso-wrap-distance-top:0;mso-wrap-style:square;position:absolute;visibility:visible;z-index:251659264" from="-56.1pt,5.3pt" to="506.65pt,6.65pt" strokecolor="#c0504d" strokeweight="2pt">
                 <v:shadow on="t" color="black" opacity="24903f" origin=",0.5" offset="0,1.57pt"/>
@@ -5759,7 +5777,7 @@
 </file>
 
 <file path=word/endnotes.xml><?xml version="1.0" encoding="utf-8"?>
-<w:endnotes xmlns:wpc="http://schemas.microsoft.com/office/word/2010/wordprocessingCanvas" xmlns:cx="http://schemas.microsoft.com/office/drawing/2014/chartex" xmlns:cx1="http://schemas.microsoft.com/office/drawing/2015/9/8/chartex" xmlns:cx2="http://schemas.microsoft.com/office/drawing/2015/10/21/chartex" xmlns:cx3="http://schemas.microsoft.com/office/drawing/2016/5/9/chartex" xmlns:cx4="http://schemas.microsoft.com/office/drawing/2016/5/10/chartex" xmlns:cx5="http://schemas.microsoft.com/office/drawing/2016/5/11/chartex" xmlns:cx6="http://schemas.microsoft.com/office/drawing/2016/5/12/chartex" xmlns:cx7="http://schemas.microsoft.com/office/drawing/2016/5/13/chartex" xmlns:cx8="http://schemas.microsoft.com/office/drawing/2016/5/14/chartex" xmlns:mc="http://schemas.openxmlformats.org/markup-compatibility/2006" xmlns:aink="http://schemas.microsoft.com/office/drawing/2016/ink" xmlns:am3d="http://schemas.microsoft.com/office/drawing/2017/model3d" xmlns:o="urn:schemas-microsoft-com:office:office" xmlns:oel="http://schemas.microsoft.com/office/2019/extlst" xmlns:r="http://schemas.openxmlformats.org/officeDocument/2006/relationships" xmlns:m="http://schemas.openxmlformats.org/officeDocument/2006/math" xmlns:v="urn:schemas-microsoft-com:vml" xmlns:wp14="http://schemas.microsoft.com/office/word/2010/wordprocessingDrawing" xmlns:wp="http://schemas.openxmlformats.org/drawingml/2006/wordprocessingDrawing" xmlns:w10="urn:schemas-microsoft-com:office:word" xmlns:w="http://schemas.openxmlformats.org/wordprocessingml/2006/main" xmlns:w14="http://schemas.microsoft.com/office/word/2010/wordml" xmlns:w15="http://schemas.microsoft.com/office/word/2012/wordml" xmlns:w16cei="http://schemas.microsoft.com/office/word/2026/wordml/cei" xmlns:w16cex="http://schemas.microsoft.com/office/word/2018/wordml/cex" xmlns:w16cid="http://schemas.microsoft.com/office/word/2016/wordml/cid" xmlns:w16="http://schemas.microsoft.com/office/word/2018/wordml" xmlns:w16du="http://schemas.microsoft.com/office/word/2023/wordml/word16du" xmlns:w16sdtdh="http://schemas.microsoft.com/office/word/2020/wordml/sdtdatahash" xmlns:w16sdtfl="http://schemas.microsoft.com/office/word/2024/wordml/sdtformatlock" xmlns:w16se="http://schemas.microsoft.com/office/word/2015/wordml/symex" xmlns:wpg="http://schemas.microsoft.com/office/word/2010/wordprocessingGroup" xmlns:wpi="http://schemas.microsoft.com/office/word/2010/wordprocessingInk" xmlns:wne="http://schemas.microsoft.com/office/word/2006/wordml" xmlns:wps="http://schemas.microsoft.com/office/word/2010/wordprocessingShape" mc:Ignorable="w14 w15 w16se w16cid w16 w16cex w16sdtdh w16sdtfl w16du wp14">
+<w:endnotes xmlns:wpc="http://schemas.microsoft.com/office/word/2010/wordprocessingCanvas" xmlns:cx="http://schemas.microsoft.com/office/drawing/2014/chartex" xmlns:cx1="http://schemas.microsoft.com/office/drawing/2015/9/8/chartex" xmlns:cx2="http://schemas.microsoft.com/office/drawing/2015/10/21/chartex" xmlns:cx3="http://schemas.microsoft.com/office/drawing/2016/5/9/chartex" xmlns:cx4="http://schemas.microsoft.com/office/drawing/2016/5/10/chartex" xmlns:cx5="http://schemas.microsoft.com/office/drawing/2016/5/11/chartex" xmlns:cx6="http://schemas.microsoft.com/office/drawing/2016/5/12/chartex" xmlns:cx7="http://schemas.microsoft.com/office/drawing/2016/5/13/chartex" xmlns:cx8="http://schemas.microsoft.com/office/drawing/2016/5/14/chartex" xmlns:mc="http://schemas.openxmlformats.org/markup-compatibility/2006" xmlns:aink="http://schemas.microsoft.com/office/drawing/2016/ink" xmlns:am3d="http://schemas.microsoft.com/office/drawing/2017/model3d" xmlns:o="urn:schemas-microsoft-com:office:office" xmlns:oel="http://schemas.microsoft.com/office/2019/extlst" xmlns:r="http://schemas.openxmlformats.org/officeDocument/2006/relationships" xmlns:m="http://schemas.openxmlformats.org/officeDocument/2006/math" xmlns:v="urn:schemas-microsoft-com:vml" xmlns:wp14="http://schemas.microsoft.com/office/word/2010/wordprocessingDrawing" xmlns:wp="http://schemas.openxmlformats.org/drawingml/2006/wordprocessingDrawing" xmlns:w10="urn:schemas-microsoft-com:office:word" xmlns:w="http://schemas.openxmlformats.org/wordprocessingml/2006/main" xmlns:w14="http://schemas.microsoft.com/office/word/2010/wordml" xmlns:w15="http://schemas.microsoft.com/office/word/2012/wordml" xmlns:w16cex="http://schemas.microsoft.com/office/word/2018/wordml/cex" xmlns:w16cid="http://schemas.microsoft.com/office/word/2016/wordml/cid" xmlns:w16="http://schemas.microsoft.com/office/word/2018/wordml" xmlns:w16du="http://schemas.microsoft.com/office/word/2023/wordml/word16du" xmlns:w16sdtdh="http://schemas.microsoft.com/office/word/2020/wordml/sdtdatahash" xmlns:w16sdtfl="http://schemas.microsoft.com/office/word/2024/wordml/sdtformatlock" xmlns:w16se="http://schemas.microsoft.com/office/word/2015/wordml/symex" xmlns:wpg="http://schemas.microsoft.com/office/word/2010/wordprocessingGroup" xmlns:wpi="http://schemas.microsoft.com/office/word/2010/wordprocessingInk" xmlns:wne="http://schemas.microsoft.com/office/word/2006/wordml" xmlns:wps="http://schemas.microsoft.com/office/word/2010/wordprocessingShape" mc:Ignorable="w14 w15 w16se w16cid w16 w16cex w16sdtdh w16sdtfl w16du wp14">
   <w:endnote w:type="separator" w:id="-1">
     <w:p>
       <w:pPr>
@@ -5784,7 +5802,7 @@
 </file>
 
 <file path=word/footer1.xml><?xml version="1.0" encoding="utf-8"?>
-<w:ftr xmlns:wpc="http://schemas.microsoft.com/office/word/2010/wordprocessingCanvas" xmlns:cx="http://schemas.microsoft.com/office/drawing/2014/chartex" xmlns:cx1="http://schemas.microsoft.com/office/drawing/2015/9/8/chartex" xmlns:cx2="http://schemas.microsoft.com/office/drawing/2015/10/21/chartex" xmlns:cx3="http://schemas.microsoft.com/office/drawing/2016/5/9/chartex" xmlns:cx4="http://schemas.microsoft.com/office/drawing/2016/5/10/chartex" xmlns:cx5="http://schemas.microsoft.com/office/drawing/2016/5/11/chartex" xmlns:cx6="http://schemas.microsoft.com/office/drawing/2016/5/12/chartex" xmlns:cx7="http://schemas.microsoft.com/office/drawing/2016/5/13/chartex" xmlns:cx8="http://schemas.microsoft.com/office/drawing/2016/5/14/chartex" xmlns:mc="http://schemas.openxmlformats.org/markup-compatibility/2006" xmlns:aink="http://schemas.microsoft.com/office/drawing/2016/ink" xmlns:am3d="http://schemas.microsoft.com/office/drawing/2017/model3d" xmlns:o="urn:schemas-microsoft-com:office:office" xmlns:oel="http://schemas.microsoft.com/office/2019/extlst" xmlns:r="http://schemas.openxmlformats.org/officeDocument/2006/relationships" xmlns:m="http://schemas.openxmlformats.org/officeDocument/2006/math" xmlns:v="urn:schemas-microsoft-com:vml" xmlns:wp14="http://schemas.microsoft.com/office/word/2010/wordprocessingDrawing" xmlns:wp="http://schemas.openxmlformats.org/drawingml/2006/wordprocessingDrawing" xmlns:w10="urn:schemas-microsoft-com:office:word" xmlns:w="http://schemas.openxmlformats.org/wordprocessingml/2006/main" xmlns:w14="http://schemas.microsoft.com/office/word/2010/wordml" xmlns:w15="http://schemas.microsoft.com/office/word/2012/wordml" xmlns:w16cei="http://schemas.microsoft.com/office/word/2026/wordml/cei" xmlns:w16cex="http://schemas.microsoft.com/office/word/2018/wordml/cex" xmlns:w16cid="http://schemas.microsoft.com/office/word/2016/wordml/cid" xmlns:w16="http://schemas.microsoft.com/office/word/2018/wordml" xmlns:w16du="http://schemas.microsoft.com/office/word/2023/wordml/word16du" xmlns:w16sdtdh="http://schemas.microsoft.com/office/word/2020/wordml/sdtdatahash" xmlns:w16sdtfl="http://schemas.microsoft.com/office/word/2024/wordml/sdtformatlock" xmlns:w16se="http://schemas.microsoft.com/office/word/2015/wordml/symex" xmlns:wpg="http://schemas.microsoft.com/office/word/2010/wordprocessingGroup" xmlns:wpi="http://schemas.microsoft.com/office/word/2010/wordprocessingInk" xmlns:wne="http://schemas.microsoft.com/office/word/2006/wordml" xmlns:wps="http://schemas.microsoft.com/office/word/2010/wordprocessingShape" mc:Ignorable="w14 w15 w16se w16cid w16 w16cex w16sdtdh w16sdtfl w16du wp14">
+<w:ftr xmlns:wpc="http://schemas.microsoft.com/office/word/2010/wordprocessingCanvas" xmlns:cx="http://schemas.microsoft.com/office/drawing/2014/chartex" xmlns:cx1="http://schemas.microsoft.com/office/drawing/2015/9/8/chartex" xmlns:cx2="http://schemas.microsoft.com/office/drawing/2015/10/21/chartex" xmlns:cx3="http://schemas.microsoft.com/office/drawing/2016/5/9/chartex" xmlns:cx4="http://schemas.microsoft.com/office/drawing/2016/5/10/chartex" xmlns:cx5="http://schemas.microsoft.com/office/drawing/2016/5/11/chartex" xmlns:cx6="http://schemas.microsoft.com/office/drawing/2016/5/12/chartex" xmlns:cx7="http://schemas.microsoft.com/office/drawing/2016/5/13/chartex" xmlns:cx8="http://schemas.microsoft.com/office/drawing/2016/5/14/chartex" xmlns:mc="http://schemas.openxmlformats.org/markup-compatibility/2006" xmlns:aink="http://schemas.microsoft.com/office/drawing/2016/ink" xmlns:am3d="http://schemas.microsoft.com/office/drawing/2017/model3d" xmlns:o="urn:schemas-microsoft-com:office:office" xmlns:oel="http://schemas.microsoft.com/office/2019/extlst" xmlns:r="http://schemas.openxmlformats.org/officeDocument/2006/relationships" xmlns:m="http://schemas.openxmlformats.org/officeDocument/2006/math" xmlns:v="urn:schemas-microsoft-com:vml" xmlns:wp14="http://schemas.microsoft.com/office/word/2010/wordprocessingDrawing" xmlns:wp="http://schemas.openxmlformats.org/drawingml/2006/wordprocessingDrawing" xmlns:w10="urn:schemas-microsoft-com:office:word" xmlns:w="http://schemas.openxmlformats.org/wordprocessingml/2006/main" xmlns:w14="http://schemas.microsoft.com/office/word/2010/wordml" xmlns:w15="http://schemas.microsoft.com/office/word/2012/wordml" xmlns:w16cex="http://schemas.microsoft.com/office/word/2018/wordml/cex" xmlns:w16cid="http://schemas.microsoft.com/office/word/2016/wordml/cid" xmlns:w16="http://schemas.microsoft.com/office/word/2018/wordml" xmlns:w16du="http://schemas.microsoft.com/office/word/2023/wordml/word16du" xmlns:w16sdtdh="http://schemas.microsoft.com/office/word/2020/wordml/sdtdatahash" xmlns:w16sdtfl="http://schemas.microsoft.com/office/word/2024/wordml/sdtformatlock" xmlns:w16se="http://schemas.microsoft.com/office/word/2015/wordml/symex" xmlns:wpg="http://schemas.microsoft.com/office/word/2010/wordprocessingGroup" xmlns:wpi="http://schemas.microsoft.com/office/word/2010/wordprocessingInk" xmlns:wne="http://schemas.microsoft.com/office/word/2006/wordml" xmlns:wps="http://schemas.microsoft.com/office/word/2010/wordprocessingShape" mc:Ignorable="w14 w15 w16se w16cid w16 w16cex w16sdtdh w16sdtfl w16du wp14">
   <w:p>
     <w:pPr>
       <w:pStyle w:val="Footer"/>
@@ -5794,7 +5812,7 @@
 </file>
 
 <file path=word/footer2.xml><?xml version="1.0" encoding="utf-8"?>
-<w:ftr xmlns:wpc="http://schemas.microsoft.com/office/word/2010/wordprocessingCanvas" xmlns:cx="http://schemas.microsoft.com/office/drawing/2014/chartex" xmlns:cx1="http://schemas.microsoft.com/office/drawing/2015/9/8/chartex" xmlns:cx2="http://schemas.microsoft.com/office/drawing/2015/10/21/chartex" xmlns:cx3="http://schemas.microsoft.com/office/drawing/2016/5/9/chartex" xmlns:cx4="http://schemas.microsoft.com/office/drawing/2016/5/10/chartex" xmlns:cx5="http://schemas.microsoft.com/office/drawing/2016/5/11/chartex" xmlns:cx6="http://schemas.microsoft.com/office/drawing/2016/5/12/chartex" xmlns:cx7="http://schemas.microsoft.com/office/drawing/2016/5/13/chartex" xmlns:cx8="http://schemas.microsoft.com/office/drawing/2016/5/14/chartex" xmlns:mc="http://schemas.openxmlformats.org/markup-compatibility/2006" xmlns:aink="http://schemas.microsoft.com/office/drawing/2016/ink" xmlns:am3d="http://schemas.microsoft.com/office/drawing/2017/model3d" xmlns:o="urn:schemas-microsoft-com:office:office" xmlns:oel="http://schemas.microsoft.com/office/2019/extlst" xmlns:r="http://schemas.openxmlformats.org/officeDocument/2006/relationships" xmlns:m="http://schemas.openxmlformats.org/officeDocument/2006/math" xmlns:v="urn:schemas-microsoft-com:vml" xmlns:wp14="http://schemas.microsoft.com/office/word/2010/wordprocessingDrawing" xmlns:wp="http://schemas.openxmlformats.org/drawingml/2006/wordprocessingDrawing" xmlns:w10="urn:schemas-microsoft-com:office:word" xmlns:w="http://schemas.openxmlformats.org/wordprocessingml/2006/main" xmlns:w14="http://schemas.microsoft.com/office/word/2010/wordml" xmlns:w15="http://schemas.microsoft.com/office/word/2012/wordml" xmlns:w16cei="http://schemas.microsoft.com/office/word/2026/wordml/cei" xmlns:w16cex="http://schemas.microsoft.com/office/word/2018/wordml/cex" xmlns:w16cid="http://schemas.microsoft.com/office/word/2016/wordml/cid" xmlns:w16="http://schemas.microsoft.com/office/word/2018/wordml" xmlns:w16du="http://schemas.microsoft.com/office/word/2023/wordml/word16du" xmlns:w16sdtdh="http://schemas.microsoft.com/office/word/2020/wordml/sdtdatahash" xmlns:w16sdtfl="http://schemas.microsoft.com/office/word/2024/wordml/sdtformatlock" xmlns:w16se="http://schemas.microsoft.com/office/word/2015/wordml/symex" xmlns:wpg="http://schemas.microsoft.com/office/word/2010/wordprocessingGroup" xmlns:wpi="http://schemas.microsoft.com/office/word/2010/wordprocessingInk" xmlns:wne="http://schemas.microsoft.com/office/word/2006/wordml" xmlns:wps="http://schemas.microsoft.com/office/word/2010/wordprocessingShape" mc:Ignorable="w14 w15 w16se w16cid w16 w16cex w16sdtdh w16sdtfl w16du wp14">
+<w:ftr xmlns:wpc="http://schemas.microsoft.com/office/word/2010/wordprocessingCanvas" xmlns:cx="http://schemas.microsoft.com/office/drawing/2014/chartex" xmlns:cx1="http://schemas.microsoft.com/office/drawing/2015/9/8/chartex" xmlns:cx2="http://schemas.microsoft.com/office/drawing/2015/10/21/chartex" xmlns:cx3="http://schemas.microsoft.com/office/drawing/2016/5/9/chartex" xmlns:cx4="http://schemas.microsoft.com/office/drawing/2016/5/10/chartex" xmlns:cx5="http://schemas.microsoft.com/office/drawing/2016/5/11/chartex" xmlns:cx6="http://schemas.microsoft.com/office/drawing/2016/5/12/chartex" xmlns:cx7="http://schemas.microsoft.com/office/drawing/2016/5/13/chartex" xmlns:cx8="http://schemas.microsoft.com/office/drawing/2016/5/14/chartex" xmlns:mc="http://schemas.openxmlformats.org/markup-compatibility/2006" xmlns:aink="http://schemas.microsoft.com/office/drawing/2016/ink" xmlns:am3d="http://schemas.microsoft.com/office/drawing/2017/model3d" xmlns:o="urn:schemas-microsoft-com:office:office" xmlns:oel="http://schemas.microsoft.com/office/2019/extlst" xmlns:r="http://schemas.openxmlformats.org/officeDocument/2006/relationships" xmlns:m="http://schemas.openxmlformats.org/officeDocument/2006/math" xmlns:v="urn:schemas-microsoft-com:vml" xmlns:wp14="http://schemas.microsoft.com/office/word/2010/wordprocessingDrawing" xmlns:wp="http://schemas.openxmlformats.org/drawingml/2006/wordprocessingDrawing" xmlns:w10="urn:schemas-microsoft-com:office:word" xmlns:w="http://schemas.openxmlformats.org/wordprocessingml/2006/main" xmlns:w14="http://schemas.microsoft.com/office/word/2010/wordml" xmlns:w15="http://schemas.microsoft.com/office/word/2012/wordml" xmlns:w16cex="http://schemas.microsoft.com/office/word/2018/wordml/cex" xmlns:w16cid="http://schemas.microsoft.com/office/word/2016/wordml/cid" xmlns:w16="http://schemas.microsoft.com/office/word/2018/wordml" xmlns:w16du="http://schemas.microsoft.com/office/word/2023/wordml/word16du" xmlns:w16sdtdh="http://schemas.microsoft.com/office/word/2020/wordml/sdtdatahash" xmlns:w16sdtfl="http://schemas.microsoft.com/office/word/2024/wordml/sdtformatlock" xmlns:w16se="http://schemas.microsoft.com/office/word/2015/wordml/symex" xmlns:wpg="http://schemas.microsoft.com/office/word/2010/wordprocessingGroup" xmlns:wpi="http://schemas.microsoft.com/office/word/2010/wordprocessingInk" xmlns:wne="http://schemas.microsoft.com/office/word/2006/wordml" xmlns:wps="http://schemas.microsoft.com/office/word/2010/wordprocessingShape" mc:Ignorable="w14 w15 w16se w16cid w16 w16cex w16sdtdh w16sdtfl w16du wp14">
   <w:sdt>
     <w:sdtPr>
       <w:rPr>
@@ -5950,7 +5968,7 @@
 </file>
 
 <file path=word/footer3.xml><?xml version="1.0" encoding="utf-8"?>
-<w:ftr xmlns:wpc="http://schemas.microsoft.com/office/word/2010/wordprocessingCanvas" xmlns:cx="http://schemas.microsoft.com/office/drawing/2014/chartex" xmlns:cx1="http://schemas.microsoft.com/office/drawing/2015/9/8/chartex" xmlns:cx2="http://schemas.microsoft.com/office/drawing/2015/10/21/chartex" xmlns:cx3="http://schemas.microsoft.com/office/drawing/2016/5/9/chartex" xmlns:cx4="http://schemas.microsoft.com/office/drawing/2016/5/10/chartex" xmlns:cx5="http://schemas.microsoft.com/office/drawing/2016/5/11/chartex" xmlns:cx6="http://schemas.microsoft.com/office/drawing/2016/5/12/chartex" xmlns:cx7="http://schemas.microsoft.com/office/drawing/2016/5/13/chartex" xmlns:cx8="http://schemas.microsoft.com/office/drawing/2016/5/14/chartex" xmlns:mc="http://schemas.openxmlformats.org/markup-compatibility/2006" xmlns:aink="http://schemas.microsoft.com/office/drawing/2016/ink" xmlns:am3d="http://schemas.microsoft.com/office/drawing/2017/model3d" xmlns:o="urn:schemas-microsoft-com:office:office" xmlns:oel="http://schemas.microsoft.com/office/2019/extlst" xmlns:r="http://schemas.openxmlformats.org/officeDocument/2006/relationships" xmlns:m="http://schemas.openxmlformats.org/officeDocument/2006/math" xmlns:v="urn:schemas-microsoft-com:vml" xmlns:wp14="http://schemas.microsoft.com/office/word/2010/wordprocessingDrawing" xmlns:wp="http://schemas.openxmlformats.org/drawingml/2006/wordprocessingDrawing" xmlns:w10="urn:schemas-microsoft-com:office:word" xmlns:w="http://schemas.openxmlformats.org/wordprocessingml/2006/main" xmlns:w14="http://schemas.microsoft.com/office/word/2010/wordml" xmlns:w15="http://schemas.microsoft.com/office/word/2012/wordml" xmlns:w16cei="http://schemas.microsoft.com/office/word/2026/wordml/cei" xmlns:w16cex="http://schemas.microsoft.com/office/word/2018/wordml/cex" xmlns:w16cid="http://schemas.microsoft.com/office/word/2016/wordml/cid" xmlns:w16="http://schemas.microsoft.com/office/word/2018/wordml" xmlns:w16du="http://schemas.microsoft.com/office/word/2023/wordml/word16du" xmlns:w16sdtdh="http://schemas.microsoft.com/office/word/2020/wordml/sdtdatahash" xmlns:w16sdtfl="http://schemas.microsoft.com/office/word/2024/wordml/sdtformatlock" xmlns:w16se="http://schemas.microsoft.com/office/word/2015/wordml/symex" xmlns:wpg="http://schemas.microsoft.com/office/word/2010/wordprocessingGroup" xmlns:wpi="http://schemas.microsoft.com/office/word/2010/wordprocessingInk" xmlns:wne="http://schemas.microsoft.com/office/word/2006/wordml" xmlns:wps="http://schemas.microsoft.com/office/word/2010/wordprocessingShape" mc:Ignorable="w14 w15 w16se w16cid w16 w16cex w16sdtdh w16sdtfl w16du wp14">
+<w:ftr xmlns:wpc="http://schemas.microsoft.com/office/word/2010/wordprocessingCanvas" xmlns:cx="http://schemas.microsoft.com/office/drawing/2014/chartex" xmlns:cx1="http://schemas.microsoft.com/office/drawing/2015/9/8/chartex" xmlns:cx2="http://schemas.microsoft.com/office/drawing/2015/10/21/chartex" xmlns:cx3="http://schemas.microsoft.com/office/drawing/2016/5/9/chartex" xmlns:cx4="http://schemas.microsoft.com/office/drawing/2016/5/10/chartex" xmlns:cx5="http://schemas.microsoft.com/office/drawing/2016/5/11/chartex" xmlns:cx6="http://schemas.microsoft.com/office/drawing/2016/5/12/chartex" xmlns:cx7="http://schemas.microsoft.com/office/drawing/2016/5/13/chartex" xmlns:cx8="http://schemas.microsoft.com/office/drawing/2016/5/14/chartex" xmlns:mc="http://schemas.openxmlformats.org/markup-compatibility/2006" xmlns:aink="http://schemas.microsoft.com/office/drawing/2016/ink" xmlns:am3d="http://schemas.microsoft.com/office/drawing/2017/model3d" xmlns:o="urn:schemas-microsoft-com:office:office" xmlns:oel="http://schemas.microsoft.com/office/2019/extlst" xmlns:r="http://schemas.openxmlformats.org/officeDocument/2006/relationships" xmlns:m="http://schemas.openxmlformats.org/officeDocument/2006/math" xmlns:v="urn:schemas-microsoft-com:vml" xmlns:wp14="http://schemas.microsoft.com/office/word/2010/wordprocessingDrawing" xmlns:wp="http://schemas.openxmlformats.org/drawingml/2006/wordprocessingDrawing" xmlns:w10="urn:schemas-microsoft-com:office:word" xmlns:w="http://schemas.openxmlformats.org/wordprocessingml/2006/main" xmlns:w14="http://schemas.microsoft.com/office/word/2010/wordml" xmlns:w15="http://schemas.microsoft.com/office/word/2012/wordml" xmlns:w16cex="http://schemas.microsoft.com/office/word/2018/wordml/cex" xmlns:w16cid="http://schemas.microsoft.com/office/word/2016/wordml/cid" xmlns:w16="http://schemas.microsoft.com/office/word/2018/wordml" xmlns:w16du="http://schemas.microsoft.com/office/word/2023/wordml/word16du" xmlns:w16sdtdh="http://schemas.microsoft.com/office/word/2020/wordml/sdtdatahash" xmlns:w16sdtfl="http://schemas.microsoft.com/office/word/2024/wordml/sdtformatlock" xmlns:w16se="http://schemas.microsoft.com/office/word/2015/wordml/symex" xmlns:wpg="http://schemas.microsoft.com/office/word/2010/wordprocessingGroup" xmlns:wpi="http://schemas.microsoft.com/office/word/2010/wordprocessingInk" xmlns:wne="http://schemas.microsoft.com/office/word/2006/wordml" xmlns:wps="http://schemas.microsoft.com/office/word/2010/wordprocessingShape" mc:Ignorable="w14 w15 w16se w16cid w16 w16cex w16sdtdh w16sdtfl w16du wp14">
   <w:p>
     <w:pPr>
       <w:pStyle w:val="Footer"/>
@@ -5960,7 +5978,7 @@
 </file>
 
 <file path=word/footnotes.xml><?xml version="1.0" encoding="utf-8"?>
-<w:footnotes xmlns:wpc="http://schemas.microsoft.com/office/word/2010/wordprocessingCanvas" xmlns:cx="http://schemas.microsoft.com/office/drawing/2014/chartex" xmlns:cx1="http://schemas.microsoft.com/office/drawing/2015/9/8/chartex" xmlns:cx2="http://schemas.microsoft.com/office/drawing/2015/10/21/chartex" xmlns:cx3="http://schemas.microsoft.com/office/drawing/2016/5/9/chartex" xmlns:cx4="http://schemas.microsoft.com/office/drawing/2016/5/10/chartex" xmlns:cx5="http://schemas.microsoft.com/office/drawing/2016/5/11/chartex" xmlns:cx6="http://schemas.microsoft.com/office/drawing/2016/5/12/chartex" xmlns:cx7="http://schemas.microsoft.com/office/drawing/2016/5/13/chartex" xmlns:cx8="http://schemas.microsoft.com/office/drawing/2016/5/14/chartex" xmlns:mc="http://schemas.openxmlformats.org/markup-compatibility/2006" xmlns:aink="http://schemas.microsoft.com/office/drawing/2016/ink" xmlns:am3d="http://schemas.microsoft.com/office/drawing/2017/model3d" xmlns:o="urn:schemas-microsoft-com:office:office" xmlns:oel="http://schemas.microsoft.com/office/2019/extlst" xmlns:r="http://schemas.openxmlformats.org/officeDocument/2006/relationships" xmlns:m="http://schemas.openxmlformats.org/officeDocument/2006/math" xmlns:v="urn:schemas-microsoft-com:vml" xmlns:wp14="http://schemas.microsoft.com/office/word/2010/wordprocessingDrawing" xmlns:wp="http://schemas.openxmlformats.org/drawingml/2006/wordprocessingDrawing" xmlns:w10="urn:schemas-microsoft-com:office:word" xmlns:w="http://schemas.openxmlformats.org/wordprocessingml/2006/main" xmlns:w14="http://schemas.microsoft.com/office/word/2010/wordml" xmlns:w15="http://schemas.microsoft.com/office/word/2012/wordml" xmlns:w16cei="http://schemas.microsoft.com/office/word/2026/wordml/cei" xmlns:w16cex="http://schemas.microsoft.com/office/word/2018/wordml/cex" xmlns:w16cid="http://schemas.microsoft.com/office/word/2016/wordml/cid" xmlns:w16="http://schemas.microsoft.com/office/word/2018/wordml" xmlns:w16du="http://schemas.microsoft.com/office/word/2023/wordml/word16du" xmlns:w16sdtdh="http://schemas.microsoft.com/office/word/2020/wordml/sdtdatahash" xmlns:w16sdtfl="http://schemas.microsoft.com/office/word/2024/wordml/sdtformatlock" xmlns:w16se="http://schemas.microsoft.com/office/word/2015/wordml/symex" xmlns:wpg="http://schemas.microsoft.com/office/word/2010/wordprocessingGroup" xmlns:wpi="http://schemas.microsoft.com/office/word/2010/wordprocessingInk" xmlns:wne="http://schemas.microsoft.com/office/word/2006/wordml" xmlns:wps="http://schemas.microsoft.com/office/word/2010/wordprocessingShape" mc:Ignorable="w14 w15 w16se w16cid w16 w16cex w16sdtdh w16sdtfl w16du wp14">
+<w:footnotes xmlns:wpc="http://schemas.microsoft.com/office/word/2010/wordprocessingCanvas" xmlns:cx="http://schemas.microsoft.com/office/drawing/2014/chartex" xmlns:cx1="http://schemas.microsoft.com/office/drawing/2015/9/8/chartex" xmlns:cx2="http://schemas.microsoft.com/office/drawing/2015/10/21/chartex" xmlns:cx3="http://schemas.microsoft.com/office/drawing/2016/5/9/chartex" xmlns:cx4="http://schemas.microsoft.com/office/drawing/2016/5/10/chartex" xmlns:cx5="http://schemas.microsoft.com/office/drawing/2016/5/11/chartex" xmlns:cx6="http://schemas.microsoft.com/office/drawing/2016/5/12/chartex" xmlns:cx7="http://schemas.microsoft.com/office/drawing/2016/5/13/chartex" xmlns:cx8="http://schemas.microsoft.com/office/drawing/2016/5/14/chartex" xmlns:mc="http://schemas.openxmlformats.org/markup-compatibility/2006" xmlns:aink="http://schemas.microsoft.com/office/drawing/2016/ink" xmlns:am3d="http://schemas.microsoft.com/office/drawing/2017/model3d" xmlns:o="urn:schemas-microsoft-com:office:office" xmlns:oel="http://schemas.microsoft.com/office/2019/extlst" xmlns:r="http://schemas.openxmlformats.org/officeDocument/2006/relationships" xmlns:m="http://schemas.openxmlformats.org/officeDocument/2006/math" xmlns:v="urn:schemas-microsoft-com:vml" xmlns:wp14="http://schemas.microsoft.com/office/word/2010/wordprocessingDrawing" xmlns:wp="http://schemas.openxmlformats.org/drawingml/2006/wordprocessingDrawing" xmlns:w10="urn:schemas-microsoft-com:office:word" xmlns:w="http://schemas.openxmlformats.org/wordprocessingml/2006/main" xmlns:w14="http://schemas.microsoft.com/office/word/2010/wordml" xmlns:w15="http://schemas.microsoft.com/office/word/2012/wordml" xmlns:w16cex="http://schemas.microsoft.com/office/word/2018/wordml/cex" xmlns:w16cid="http://schemas.microsoft.com/office/word/2016/wordml/cid" xmlns:w16="http://schemas.microsoft.com/office/word/2018/wordml" xmlns:w16du="http://schemas.microsoft.com/office/word/2023/wordml/word16du" xmlns:w16sdtdh="http://schemas.microsoft.com/office/word/2020/wordml/sdtdatahash" xmlns:w16sdtfl="http://schemas.microsoft.com/office/word/2024/wordml/sdtformatlock" xmlns:w16se="http://schemas.microsoft.com/office/word/2015/wordml/symex" xmlns:wpg="http://schemas.microsoft.com/office/word/2010/wordprocessingGroup" xmlns:wpi="http://schemas.microsoft.com/office/word/2010/wordprocessingInk" xmlns:wne="http://schemas.microsoft.com/office/word/2006/wordml" xmlns:wps="http://schemas.microsoft.com/office/word/2010/wordprocessingShape" mc:Ignorable="w14 w15 w16se w16cid w16 w16cex w16sdtdh w16sdtfl w16du wp14">
   <w:footnote w:type="separator" w:id="-1">
     <w:p>
       <w:pPr>
@@ -5985,7 +6003,7 @@
 </file>
 
 <file path=word/header1.xml><?xml version="1.0" encoding="utf-8"?>
-<w:hdr xmlns:wpc="http://schemas.microsoft.com/office/word/2010/wordprocessingCanvas" xmlns:cx="http://schemas.microsoft.com/office/drawing/2014/chartex" xmlns:cx1="http://schemas.microsoft.com/office/drawing/2015/9/8/chartex" xmlns:cx2="http://schemas.microsoft.com/office/drawing/2015/10/21/chartex" xmlns:cx3="http://schemas.microsoft.com/office/drawing/2016/5/9/chartex" xmlns:cx4="http://schemas.microsoft.com/office/drawing/2016/5/10/chartex" xmlns:cx5="http://schemas.microsoft.com/office/drawing/2016/5/11/chartex" xmlns:cx6="http://schemas.microsoft.com/office/drawing/2016/5/12/chartex" xmlns:cx7="http://schemas.microsoft.com/office/drawing/2016/5/13/chartex" xmlns:cx8="http://schemas.microsoft.com/office/drawing/2016/5/14/chartex" xmlns:mc="http://schemas.openxmlformats.org/markup-compatibility/2006" xmlns:aink="http://schemas.microsoft.com/office/drawing/2016/ink" xmlns:am3d="http://schemas.microsoft.com/office/drawing/2017/model3d" xmlns:o="urn:schemas-microsoft-com:office:office" xmlns:oel="http://schemas.microsoft.com/office/2019/extlst" xmlns:r="http://schemas.openxmlformats.org/officeDocument/2006/relationships" xmlns:m="http://schemas.openxmlformats.org/officeDocument/2006/math" xmlns:v="urn:schemas-microsoft-com:vml" xmlns:wp14="http://schemas.microsoft.com/office/word/2010/wordprocessingDrawing" xmlns:wp="http://schemas.openxmlformats.org/drawingml/2006/wordprocessingDrawing" xmlns:w10="urn:schemas-microsoft-com:office:word" xmlns:w="http://schemas.openxmlformats.org/wordprocessingml/2006/main" xmlns:w14="http://schemas.microsoft.com/office/word/2010/wordml" xmlns:w15="http://schemas.microsoft.com/office/word/2012/wordml" xmlns:w16cei="http://schemas.microsoft.com/office/word/2026/wordml/cei" xmlns:w16cex="http://schemas.microsoft.com/office/word/2018/wordml/cex" xmlns:w16cid="http://schemas.microsoft.com/office/word/2016/wordml/cid" xmlns:w16="http://schemas.microsoft.com/office/word/2018/wordml" xmlns:w16du="http://schemas.microsoft.com/office/word/2023/wordml/word16du" xmlns:w16sdtdh="http://schemas.microsoft.com/office/word/2020/wordml/sdtdatahash" xmlns:w16sdtfl="http://schemas.microsoft.com/office/word/2024/wordml/sdtformatlock" xmlns:w16se="http://schemas.microsoft.com/office/word/2015/wordml/symex" xmlns:wpg="http://schemas.microsoft.com/office/word/2010/wordprocessingGroup" xmlns:wpi="http://schemas.microsoft.com/office/word/2010/wordprocessingInk" xmlns:wne="http://schemas.microsoft.com/office/word/2006/wordml" xmlns:wps="http://schemas.microsoft.com/office/word/2010/wordprocessingShape" mc:Ignorable="w14 w15 w16se w16cid w16 w16cex w16sdtdh w16sdtfl w16du wp14">
+<w:hdr xmlns:wpc="http://schemas.microsoft.com/office/word/2010/wordprocessingCanvas" xmlns:cx="http://schemas.microsoft.com/office/drawing/2014/chartex" xmlns:cx1="http://schemas.microsoft.com/office/drawing/2015/9/8/chartex" xmlns:cx2="http://schemas.microsoft.com/office/drawing/2015/10/21/chartex" xmlns:cx3="http://schemas.microsoft.com/office/drawing/2016/5/9/chartex" xmlns:cx4="http://schemas.microsoft.com/office/drawing/2016/5/10/chartex" xmlns:cx5="http://schemas.microsoft.com/office/drawing/2016/5/11/chartex" xmlns:cx6="http://schemas.microsoft.com/office/drawing/2016/5/12/chartex" xmlns:cx7="http://schemas.microsoft.com/office/drawing/2016/5/13/chartex" xmlns:cx8="http://schemas.microsoft.com/office/drawing/2016/5/14/chartex" xmlns:mc="http://schemas.openxmlformats.org/markup-compatibility/2006" xmlns:aink="http://schemas.microsoft.com/office/drawing/2016/ink" xmlns:am3d="http://schemas.microsoft.com/office/drawing/2017/model3d" xmlns:o="urn:schemas-microsoft-com:office:office" xmlns:oel="http://schemas.microsoft.com/office/2019/extlst" xmlns:r="http://schemas.openxmlformats.org/officeDocument/2006/relationships" xmlns:m="http://schemas.openxmlformats.org/officeDocument/2006/math" xmlns:v="urn:schemas-microsoft-com:vml" xmlns:wp14="http://schemas.microsoft.com/office/word/2010/wordprocessingDrawing" xmlns:wp="http://schemas.openxmlformats.org/drawingml/2006/wordprocessingDrawing" xmlns:w10="urn:schemas-microsoft-com:office:word" xmlns:w="http://schemas.openxmlformats.org/wordprocessingml/2006/main" xmlns:w14="http://schemas.microsoft.com/office/word/2010/wordml" xmlns:w15="http://schemas.microsoft.com/office/word/2012/wordml" xmlns:w16cex="http://schemas.microsoft.com/office/word/2018/wordml/cex" xmlns:w16cid="http://schemas.microsoft.com/office/word/2016/wordml/cid" xmlns:w16="http://schemas.microsoft.com/office/word/2018/wordml" xmlns:w16du="http://schemas.microsoft.com/office/word/2023/wordml/word16du" xmlns:w16sdtdh="http://schemas.microsoft.com/office/word/2020/wordml/sdtdatahash" xmlns:w16sdtfl="http://schemas.microsoft.com/office/word/2024/wordml/sdtformatlock" xmlns:w16se="http://schemas.microsoft.com/office/word/2015/wordml/symex" xmlns:wpg="http://schemas.microsoft.com/office/word/2010/wordprocessingGroup" xmlns:wpi="http://schemas.microsoft.com/office/word/2010/wordprocessingInk" xmlns:wne="http://schemas.microsoft.com/office/word/2006/wordml" xmlns:wps="http://schemas.microsoft.com/office/word/2010/wordprocessingShape" mc:Ignorable="w14 w15 w16se w16cid w16 w16cex w16sdtdh w16sdtfl w16du wp14">
   <w:p>
     <w:pPr>
       <w:pStyle w:val="Header"/>
@@ -5995,7 +6013,7 @@
 </file>
 
 <file path=word/header2.xml><?xml version="1.0" encoding="utf-8"?>
-<w:hdr xmlns:wpc="http://schemas.microsoft.com/office/word/2010/wordprocessingCanvas" xmlns:cx="http://schemas.microsoft.com/office/drawing/2014/chartex" xmlns:cx1="http://schemas.microsoft.com/office/drawing/2015/9/8/chartex" xmlns:cx2="http://schemas.microsoft.com/office/drawing/2015/10/21/chartex" xmlns:cx3="http://schemas.microsoft.com/office/drawing/2016/5/9/chartex" xmlns:cx4="http://schemas.microsoft.com/office/drawing/2016/5/10/chartex" xmlns:cx5="http://schemas.microsoft.com/office/drawing/2016/5/11/chartex" xmlns:cx6="http://schemas.microsoft.com/office/drawing/2016/5/12/chartex" xmlns:cx7="http://schemas.microsoft.com/office/drawing/2016/5/13/chartex" xmlns:cx8="http://schemas.microsoft.com/office/drawing/2016/5/14/chartex" xmlns:mc="http://schemas.openxmlformats.org/markup-compatibility/2006" xmlns:aink="http://schemas.microsoft.com/office/drawing/2016/ink" xmlns:am3d="http://schemas.microsoft.com/office/drawing/2017/model3d" xmlns:o="urn:schemas-microsoft-com:office:office" xmlns:oel="http://schemas.microsoft.com/office/2019/extlst" xmlns:r="http://schemas.openxmlformats.org/officeDocument/2006/relationships" xmlns:m="http://schemas.openxmlformats.org/officeDocument/2006/math" xmlns:v="urn:schemas-microsoft-com:vml" xmlns:wp14="http://schemas.microsoft.com/office/word/2010/wordprocessingDrawing" xmlns:wp="http://schemas.openxmlformats.org/drawingml/2006/wordprocessingDrawing" xmlns:w10="urn:schemas-microsoft-com:office:word" xmlns:w="http://schemas.openxmlformats.org/wordprocessingml/2006/main" xmlns:w14="http://schemas.microsoft.com/office/word/2010/wordml" xmlns:w15="http://schemas.microsoft.com/office/word/2012/wordml" xmlns:w16cei="http://schemas.microsoft.com/office/word/2026/wordml/cei" xmlns:w16cex="http://schemas.microsoft.com/office/word/2018/wordml/cex" xmlns:w16cid="http://schemas.microsoft.com/office/word/2016/wordml/cid" xmlns:w16="http://schemas.microsoft.com/office/word/2018/wordml" xmlns:w16du="http://schemas.microsoft.com/office/word/2023/wordml/word16du" xmlns:w16sdtdh="http://schemas.microsoft.com/office/word/2020/wordml/sdtdatahash" xmlns:w16sdtfl="http://schemas.microsoft.com/office/word/2024/wordml/sdtformatlock" xmlns:w16se="http://schemas.microsoft.com/office/word/2015/wordml/symex" xmlns:wpg="http://schemas.microsoft.com/office/word/2010/wordprocessingGroup" xmlns:wpi="http://schemas.microsoft.com/office/word/2010/wordprocessingInk" xmlns:wne="http://schemas.microsoft.com/office/word/2006/wordml" xmlns:wps="http://schemas.microsoft.com/office/word/2010/wordprocessingShape" mc:Ignorable="w14 w15 w16se w16cid w16 w16cex w16sdtdh w16sdtfl w16du wp14">
+<w:hdr xmlns:wpc="http://schemas.microsoft.com/office/word/2010/wordprocessingCanvas" xmlns:cx="http://schemas.microsoft.com/office/drawing/2014/chartex" xmlns:cx1="http://schemas.microsoft.com/office/drawing/2015/9/8/chartex" xmlns:cx2="http://schemas.microsoft.com/office/drawing/2015/10/21/chartex" xmlns:cx3="http://schemas.microsoft.com/office/drawing/2016/5/9/chartex" xmlns:cx4="http://schemas.microsoft.com/office/drawing/2016/5/10/chartex" xmlns:cx5="http://schemas.microsoft.com/office/drawing/2016/5/11/chartex" xmlns:cx6="http://schemas.microsoft.com/office/drawing/2016/5/12/chartex" xmlns:cx7="http://schemas.microsoft.com/office/drawing/2016/5/13/chartex" xmlns:cx8="http://schemas.microsoft.com/office/drawing/2016/5/14/chartex" xmlns:mc="http://schemas.openxmlformats.org/markup-compatibility/2006" xmlns:aink="http://schemas.microsoft.com/office/drawing/2016/ink" xmlns:am3d="http://schemas.microsoft.com/office/drawing/2017/model3d" xmlns:o="urn:schemas-microsoft-com:office:office" xmlns:oel="http://schemas.microsoft.com/office/2019/extlst" xmlns:r="http://schemas.openxmlformats.org/officeDocument/2006/relationships" xmlns:m="http://schemas.openxmlformats.org/officeDocument/2006/math" xmlns:v="urn:schemas-microsoft-com:vml" xmlns:wp14="http://schemas.microsoft.com/office/word/2010/wordprocessingDrawing" xmlns:wp="http://schemas.openxmlformats.org/drawingml/2006/wordprocessingDrawing" xmlns:w10="urn:schemas-microsoft-com:office:word" xmlns:w="http://schemas.openxmlformats.org/wordprocessingml/2006/main" xmlns:w14="http://schemas.microsoft.com/office/word/2010/wordml" xmlns:w15="http://schemas.microsoft.com/office/word/2012/wordml" xmlns:w16cex="http://schemas.microsoft.com/office/word/2018/wordml/cex" xmlns:w16cid="http://schemas.microsoft.com/office/word/2016/wordml/cid" xmlns:w16="http://schemas.microsoft.com/office/word/2018/wordml" xmlns:w16du="http://schemas.microsoft.com/office/word/2023/wordml/word16du" xmlns:w16sdtdh="http://schemas.microsoft.com/office/word/2020/wordml/sdtdatahash" xmlns:w16sdtfl="http://schemas.microsoft.com/office/word/2024/wordml/sdtformatlock" xmlns:w16se="http://schemas.microsoft.com/office/word/2015/wordml/symex" xmlns:wpg="http://schemas.microsoft.com/office/word/2010/wordprocessingGroup" xmlns:wpi="http://schemas.microsoft.com/office/word/2010/wordprocessingInk" xmlns:wne="http://schemas.microsoft.com/office/word/2006/wordml" xmlns:wps="http://schemas.microsoft.com/office/word/2010/wordprocessingShape" mc:Ignorable="w14 w15 w16se w16cid w16 w16cex w16sdtdh w16sdtfl w16du wp14">
   <w:p>
     <w:pPr>
       <w:pStyle w:val="Header"/>
@@ -6005,7 +6023,7 @@
 </file>
 
 <file path=word/header3.xml><?xml version="1.0" encoding="utf-8"?>
-<w:hdr xmlns:wpc="http://schemas.microsoft.com/office/word/2010/wordprocessingCanvas" xmlns:cx="http://schemas.microsoft.com/office/drawing/2014/chartex" xmlns:cx1="http://schemas.microsoft.com/office/drawing/2015/9/8/chartex" xmlns:cx2="http://schemas.microsoft.com/office/drawing/2015/10/21/chartex" xmlns:cx3="http://schemas.microsoft.com/office/drawing/2016/5/9/chartex" xmlns:cx4="http://schemas.microsoft.com/office/drawing/2016/5/10/chartex" xmlns:cx5="http://schemas.microsoft.com/office/drawing/2016/5/11/chartex" xmlns:cx6="http://schemas.microsoft.com/office/drawing/2016/5/12/chartex" xmlns:cx7="http://schemas.microsoft.com/office/drawing/2016/5/13/chartex" xmlns:cx8="http://schemas.microsoft.com/office/drawing/2016/5/14/chartex" xmlns:mc="http://schemas.openxmlformats.org/markup-compatibility/2006" xmlns:aink="http://schemas.microsoft.com/office/drawing/2016/ink" xmlns:am3d="http://schemas.microsoft.com/office/drawing/2017/model3d" xmlns:o="urn:schemas-microsoft-com:office:office" xmlns:oel="http://schemas.microsoft.com/office/2019/extlst" xmlns:r="http://schemas.openxmlformats.org/officeDocument/2006/relationships" xmlns:m="http://schemas.openxmlformats.org/officeDocument/2006/math" xmlns:v="urn:schemas-microsoft-com:vml" xmlns:wp14="http://schemas.microsoft.com/office/word/2010/wordprocessingDrawing" xmlns:wp="http://schemas.openxmlformats.org/drawingml/2006/wordprocessingDrawing" xmlns:w10="urn:schemas-microsoft-com:office:word" xmlns:w="http://schemas.openxmlformats.org/wordprocessingml/2006/main" xmlns:w14="http://schemas.microsoft.com/office/word/2010/wordml" xmlns:w15="http://schemas.microsoft.com/office/word/2012/wordml" xmlns:w16cei="http://schemas.microsoft.com/office/word/2026/wordml/cei" xmlns:w16cex="http://schemas.microsoft.com/office/word/2018/wordml/cex" xmlns:w16cid="http://schemas.microsoft.com/office/word/2016/wordml/cid" xmlns:w16="http://schemas.microsoft.com/office/word/2018/wordml" xmlns:w16du="http://schemas.microsoft.com/office/word/2023/wordml/word16du" xmlns:w16sdtdh="http://schemas.microsoft.com/office/word/2020/wordml/sdtdatahash" xmlns:w16sdtfl="http://schemas.microsoft.com/office/word/2024/wordml/sdtformatlock" xmlns:w16se="http://schemas.microsoft.com/office/word/2015/wordml/symex" xmlns:wpg="http://schemas.microsoft.com/office/word/2010/wordprocessingGroup" xmlns:wpi="http://schemas.microsoft.com/office/word/2010/wordprocessingInk" xmlns:wne="http://schemas.microsoft.com/office/word/2006/wordml" xmlns:wps="http://schemas.microsoft.com/office/word/2010/wordprocessingShape" mc:Ignorable="w14 w15 w16se w16cid w16 w16cex w16sdtdh w16sdtfl w16du wp14">
+<w:hdr xmlns:wpc="http://schemas.microsoft.com/office/word/2010/wordprocessingCanvas" xmlns:cx="http://schemas.microsoft.com/office/drawing/2014/chartex" xmlns:cx1="http://schemas.microsoft.com/office/drawing/2015/9/8/chartex" xmlns:cx2="http://schemas.microsoft.com/office/drawing/2015/10/21/chartex" xmlns:cx3="http://schemas.microsoft.com/office/drawing/2016/5/9/chartex" xmlns:cx4="http://schemas.microsoft.com/office/drawing/2016/5/10/chartex" xmlns:cx5="http://schemas.microsoft.com/office/drawing/2016/5/11/chartex" xmlns:cx6="http://schemas.microsoft.com/office/drawing/2016/5/12/chartex" xmlns:cx7="http://schemas.microsoft.com/office/drawing/2016/5/13/chartex" xmlns:cx8="http://schemas.microsoft.com/office/drawing/2016/5/14/chartex" xmlns:mc="http://schemas.openxmlformats.org/markup-compatibility/2006" xmlns:aink="http://schemas.microsoft.com/office/drawing/2016/ink" xmlns:am3d="http://schemas.microsoft.com/office/drawing/2017/model3d" xmlns:o="urn:schemas-microsoft-com:office:office" xmlns:oel="http://schemas.microsoft.com/office/2019/extlst" xmlns:r="http://schemas.openxmlformats.org/officeDocument/2006/relationships" xmlns:m="http://schemas.openxmlformats.org/officeDocument/2006/math" xmlns:v="urn:schemas-microsoft-com:vml" xmlns:wp14="http://schemas.microsoft.com/office/word/2010/wordprocessingDrawing" xmlns:wp="http://schemas.openxmlformats.org/drawingml/2006/wordprocessingDrawing" xmlns:w10="urn:schemas-microsoft-com:office:word" xmlns:w="http://schemas.openxmlformats.org/wordprocessingml/2006/main" xmlns:w14="http://schemas.microsoft.com/office/word/2010/wordml" xmlns:w15="http://schemas.microsoft.com/office/word/2012/wordml" xmlns:w16cex="http://schemas.microsoft.com/office/word/2018/wordml/cex" xmlns:w16cid="http://schemas.microsoft.com/office/word/2016/wordml/cid" xmlns:w16="http://schemas.microsoft.com/office/word/2018/wordml" xmlns:w16du="http://schemas.microsoft.com/office/word/2023/wordml/word16du" xmlns:w16sdtdh="http://schemas.microsoft.com/office/word/2020/wordml/sdtdatahash" xmlns:w16sdtfl="http://schemas.microsoft.com/office/word/2024/wordml/sdtformatlock" xmlns:w16se="http://schemas.microsoft.com/office/word/2015/wordml/symex" xmlns:wpg="http://schemas.microsoft.com/office/word/2010/wordprocessingGroup" xmlns:wpi="http://schemas.microsoft.com/office/word/2010/wordprocessingInk" xmlns:wne="http://schemas.microsoft.com/office/word/2006/wordml" xmlns:wps="http://schemas.microsoft.com/office/word/2010/wordprocessingShape" mc:Ignorable="w14 w15 w16se w16cid w16 w16cex w16sdtdh w16sdtfl w16du wp14">
   <w:p>
     <w:pPr>
       <w:pStyle w:val="Header"/>
@@ -6015,7 +6033,7 @@
 </file>
 
 <file path=word/numbering.xml><?xml version="1.0" encoding="utf-8"?>
-<w:numbering xmlns:wpc="http://schemas.microsoft.com/office/word/2010/wordprocessingCanvas" xmlns:cx="http://schemas.microsoft.com/office/drawing/2014/chartex" xmlns:cx1="http://schemas.microsoft.com/office/drawing/2015/9/8/chartex" xmlns:cx2="http://schemas.microsoft.com/office/drawing/2015/10/21/chartex" xmlns:cx3="http://schemas.microsoft.com/office/drawing/2016/5/9/chartex" xmlns:cx4="http://schemas.microsoft.com/office/drawing/2016/5/10/chartex" xmlns:cx5="http://schemas.microsoft.com/office/drawing/2016/5/11/chartex" xmlns:cx6="http://schemas.microsoft.com/office/drawing/2016/5/12/chartex" xmlns:cx7="http://schemas.microsoft.com/office/drawing/2016/5/13/chartex" xmlns:cx8="http://schemas.microsoft.com/office/drawing/2016/5/14/chartex" xmlns:mc="http://schemas.openxmlformats.org/markup-compatibility/2006" xmlns:aink="http://schemas.microsoft.com/office/drawing/2016/ink" xmlns:am3d="http://schemas.microsoft.com/office/drawing/2017/model3d" xmlns:o="urn:schemas-microsoft-com:office:office" xmlns:oel="http://schemas.microsoft.com/office/2019/extlst" xmlns:r="http://schemas.openxmlformats.org/officeDocument/2006/relationships" xmlns:m="http://schemas.openxmlformats.org/officeDocument/2006/math" xmlns:v="urn:schemas-microsoft-com:vml" xmlns:wp14="http://schemas.microsoft.com/office/word/2010/wordprocessingDrawing" xmlns:wp="http://schemas.openxmlformats.org/drawingml/2006/wordprocessingDrawing" xmlns:w10="urn:schemas-microsoft-com:office:word" xmlns:w="http://schemas.openxmlformats.org/wordprocessingml/2006/main" xmlns:w14="http://schemas.microsoft.com/office/word/2010/wordml" xmlns:w15="http://schemas.microsoft.com/office/word/2012/wordml" xmlns:w16cei="http://schemas.microsoft.com/office/word/2026/wordml/cei" xmlns:w16cex="http://schemas.microsoft.com/office/word/2018/wordml/cex" xmlns:w16cid="http://schemas.microsoft.com/office/word/2016/wordml/cid" xmlns:w16="http://schemas.microsoft.com/office/word/2018/wordml" xmlns:w16du="http://schemas.microsoft.com/office/word/2023/wordml/word16du" xmlns:w16sdtdh="http://schemas.microsoft.com/office/word/2020/wordml/sdtdatahash" xmlns:w16sdtfl="http://schemas.microsoft.com/office/word/2024/wordml/sdtformatlock" xmlns:w16se="http://schemas.microsoft.com/office/word/2015/wordml/symex" xmlns:wpg="http://schemas.microsoft.com/office/word/2010/wordprocessingGroup" xmlns:wpi="http://schemas.microsoft.com/office/word/2010/wordprocessingInk" xmlns:wne="http://schemas.microsoft.com/office/word/2006/wordml" xmlns:wps="http://schemas.microsoft.com/office/word/2010/wordprocessingShape" mc:Ignorable="w14 w15 w16se w16cid w16 w16cex w16sdtdh w16sdtfl w16du wp14">
+<w:numbering xmlns:wpc="http://schemas.microsoft.com/office/word/2010/wordprocessingCanvas" xmlns:cx="http://schemas.microsoft.com/office/drawing/2014/chartex" xmlns:cx1="http://schemas.microsoft.com/office/drawing/2015/9/8/chartex" xmlns:cx2="http://schemas.microsoft.com/office/drawing/2015/10/21/chartex" xmlns:cx3="http://schemas.microsoft.com/office/drawing/2016/5/9/chartex" xmlns:cx4="http://schemas.microsoft.com/office/drawing/2016/5/10/chartex" xmlns:cx5="http://schemas.microsoft.com/office/drawing/2016/5/11/chartex" xmlns:cx6="http://schemas.microsoft.com/office/drawing/2016/5/12/chartex" xmlns:cx7="http://schemas.microsoft.com/office/drawing/2016/5/13/chartex" xmlns:cx8="http://schemas.microsoft.com/office/drawing/2016/5/14/chartex" xmlns:mc="http://schemas.openxmlformats.org/markup-compatibility/2006" xmlns:aink="http://schemas.microsoft.com/office/drawing/2016/ink" xmlns:am3d="http://schemas.microsoft.com/office/drawing/2017/model3d" xmlns:o="urn:schemas-microsoft-com:office:office" xmlns:oel="http://schemas.microsoft.com/office/2019/extlst" xmlns:r="http://schemas.openxmlformats.org/officeDocument/2006/relationships" xmlns:m="http://schemas.openxmlformats.org/officeDocument/2006/math" xmlns:v="urn:schemas-microsoft-com:vml" xmlns:wp14="http://schemas.microsoft.com/office/word/2010/wordprocessingDrawing" xmlns:wp="http://schemas.openxmlformats.org/drawingml/2006/wordprocessingDrawing" xmlns:w10="urn:schemas-microsoft-com:office:word" xmlns:w="http://schemas.openxmlformats.org/wordprocessingml/2006/main" xmlns:w14="http://schemas.microsoft.com/office/word/2010/wordml" xmlns:w15="http://schemas.microsoft.com/office/word/2012/wordml" xmlns:w16cex="http://schemas.microsoft.com/office/word/2018/wordml/cex" xmlns:w16cid="http://schemas.microsoft.com/office/word/2016/wordml/cid" xmlns:w16="http://schemas.microsoft.com/office/word/2018/wordml" xmlns:w16du="http://schemas.microsoft.com/office/word/2023/wordml/word16du" xmlns:w16sdtdh="http://schemas.microsoft.com/office/word/2020/wordml/sdtdatahash" xmlns:w16sdtfl="http://schemas.microsoft.com/office/word/2024/wordml/sdtformatlock" xmlns:w16se="http://schemas.microsoft.com/office/word/2015/wordml/symex" xmlns:wpg="http://schemas.microsoft.com/office/word/2010/wordprocessingGroup" xmlns:wpi="http://schemas.microsoft.com/office/word/2010/wordprocessingInk" xmlns:wne="http://schemas.microsoft.com/office/word/2006/wordml" xmlns:wps="http://schemas.microsoft.com/office/word/2010/wordprocessingShape" mc:Ignorable="w14 w15 w16se w16cid w16 w16cex w16sdtdh w16sdtfl w16du wp14">
   <w:abstractNum w:abstractNumId="0" w15:restartNumberingAfterBreak="0">
     <w:nsid w:val="192548C2"/>
     <w:multiLevelType w:val="multilevel"/>
@@ -7552,7 +7570,7 @@
 </file>
 
 <file path=word/glossary/document.xml><?xml version="1.0" encoding="utf-8"?>
-<w:glossaryDocument xmlns:wpc="http://schemas.microsoft.com/office/word/2010/wordprocessingCanvas" xmlns:cx="http://schemas.microsoft.com/office/drawing/2014/chartex" xmlns:cx1="http://schemas.microsoft.com/office/drawing/2015/9/8/chartex" xmlns:cx2="http://schemas.microsoft.com/office/drawing/2015/10/21/chartex" xmlns:cx3="http://schemas.microsoft.com/office/drawing/2016/5/9/chartex" xmlns:cx4="http://schemas.microsoft.com/office/drawing/2016/5/10/chartex" xmlns:cx5="http://schemas.microsoft.com/office/drawing/2016/5/11/chartex" xmlns:cx6="http://schemas.microsoft.com/office/drawing/2016/5/12/chartex" xmlns:cx7="http://schemas.microsoft.com/office/drawing/2016/5/13/chartex" xmlns:cx8="http://schemas.microsoft.com/office/drawing/2016/5/14/chartex" xmlns:mc="http://schemas.openxmlformats.org/markup-compatibility/2006" xmlns:aink="http://schemas.microsoft.com/office/drawing/2016/ink" xmlns:am3d="http://schemas.microsoft.com/office/drawing/2017/model3d" xmlns:o="urn:schemas-microsoft-com:office:office" xmlns:oel="http://schemas.microsoft.com/office/2019/extlst" xmlns:r="http://schemas.openxmlformats.org/officeDocument/2006/relationships" xmlns:m="http://schemas.openxmlformats.org/officeDocument/2006/math" xmlns:v="urn:schemas-microsoft-com:vml" xmlns:wp14="http://schemas.microsoft.com/office/word/2010/wordprocessingDrawing" xmlns:wp="http://schemas.openxmlformats.org/drawingml/2006/wordprocessingDrawing" xmlns:w10="urn:schemas-microsoft-com:office:word" xmlns:w="http://schemas.openxmlformats.org/wordprocessingml/2006/main" xmlns:w14="http://schemas.microsoft.com/office/word/2010/wordml" xmlns:w15="http://schemas.microsoft.com/office/word/2012/wordml" xmlns:w16cei="http://schemas.microsoft.com/office/word/2026/wordml/cei" xmlns:w16cex="http://schemas.microsoft.com/office/word/2018/wordml/cex" xmlns:w16cid="http://schemas.microsoft.com/office/word/2016/wordml/cid" xmlns:w16="http://schemas.microsoft.com/office/word/2018/wordml" xmlns:w16du="http://schemas.microsoft.com/office/word/2023/wordml/word16du" xmlns:w16sdtdh="http://schemas.microsoft.com/office/word/2020/wordml/sdtdatahash" xmlns:w16sdtfl="http://schemas.microsoft.com/office/word/2024/wordml/sdtformatlock" xmlns:w16se="http://schemas.microsoft.com/office/word/2015/wordml/symex" xmlns:wpg="http://schemas.microsoft.com/office/word/2010/wordprocessingGroup" xmlns:wpi="http://schemas.microsoft.com/office/word/2010/wordprocessingInk" xmlns:wne="http://schemas.microsoft.com/office/word/2006/wordml" xmlns:wps="http://schemas.microsoft.com/office/word/2010/wordprocessingShape" mc:Ignorable="w14 w15 w16se w16cid w16 w16cex w16sdtdh w16sdtfl w16du wp14">
+<w:glossaryDocument xmlns:wpc="http://schemas.microsoft.com/office/word/2010/wordprocessingCanvas" xmlns:cx="http://schemas.microsoft.com/office/drawing/2014/chartex" xmlns:cx1="http://schemas.microsoft.com/office/drawing/2015/9/8/chartex" xmlns:cx2="http://schemas.microsoft.com/office/drawing/2015/10/21/chartex" xmlns:cx3="http://schemas.microsoft.com/office/drawing/2016/5/9/chartex" xmlns:cx4="http://schemas.microsoft.com/office/drawing/2016/5/10/chartex" xmlns:cx5="http://schemas.microsoft.com/office/drawing/2016/5/11/chartex" xmlns:cx6="http://schemas.microsoft.com/office/drawing/2016/5/12/chartex" xmlns:cx7="http://schemas.microsoft.com/office/drawing/2016/5/13/chartex" xmlns:cx8="http://schemas.microsoft.com/office/drawing/2016/5/14/chartex" xmlns:mc="http://schemas.openxmlformats.org/markup-compatibility/2006" xmlns:aink="http://schemas.microsoft.com/office/drawing/2016/ink" xmlns:am3d="http://schemas.microsoft.com/office/drawing/2017/model3d" xmlns:o="urn:schemas-microsoft-com:office:office" xmlns:oel="http://schemas.microsoft.com/office/2019/extlst" xmlns:r="http://schemas.openxmlformats.org/officeDocument/2006/relationships" xmlns:m="http://schemas.openxmlformats.org/officeDocument/2006/math" xmlns:v="urn:schemas-microsoft-com:vml" xmlns:wp14="http://schemas.microsoft.com/office/word/2010/wordprocessingDrawing" xmlns:wp="http://schemas.openxmlformats.org/drawingml/2006/wordprocessingDrawing" xmlns:w10="urn:schemas-microsoft-com:office:word" xmlns:w="http://schemas.openxmlformats.org/wordprocessingml/2006/main" xmlns:w14="http://schemas.microsoft.com/office/word/2010/wordml" xmlns:w15="http://schemas.microsoft.com/office/word/2012/wordml" xmlns:w16cex="http://schemas.microsoft.com/office/word/2018/wordml/cex" xmlns:w16cid="http://schemas.microsoft.com/office/word/2016/wordml/cid" xmlns:w16="http://schemas.microsoft.com/office/word/2018/wordml" xmlns:w16du="http://schemas.microsoft.com/office/word/2023/wordml/word16du" xmlns:w16sdtdh="http://schemas.microsoft.com/office/word/2020/wordml/sdtdatahash" xmlns:w16sdtfl="http://schemas.microsoft.com/office/word/2024/wordml/sdtformatlock" xmlns:w16se="http://schemas.microsoft.com/office/word/2015/wordml/symex" xmlns:wpg="http://schemas.microsoft.com/office/word/2010/wordprocessingGroup" xmlns:wpi="http://schemas.microsoft.com/office/word/2010/wordprocessingInk" xmlns:wne="http://schemas.microsoft.com/office/word/2006/wordml" xmlns:wps="http://schemas.microsoft.com/office/word/2010/wordprocessingShape" mc:Ignorable="w14 w15 w16se w16cid w16 w16cex w16sdtdh w16sdtfl w16du wp14">
   <w:docParts>
     <w:docPart>
       <w:docPartPr>
@@ -7746,38 +7764,6 @@
         </w:p>
       </w:docPartBody>
     </w:docPart>
-    <w:docPart>
-      <w:docPartPr>
-        <w:name w:val="09241EB5F9C142A7B3E267CAD3232654"/>
-        <w:category>
-          <w:name w:val="General"/>
-          <w:gallery w:val="placeholder"/>
-        </w:category>
-        <w:types>
-          <w:type w:val="bbPlcHdr"/>
-        </w:types>
-        <w:behaviors>
-          <w:behavior w:val="content"/>
-        </w:behaviors>
-        <w:guid w:val="{A024961F-5D9F-4B8E-977B-0B22E7626277}"/>
-      </w:docPartPr>
-      <w:docPartBody>
-        <w:p>
-          <w:pPr>
-            <w:pStyle w:val="09241EB5F9C142A7B3E267CAD3232654"/>
-          </w:pPr>
-          <w:r>
-            <w:rPr>
-              <w:rFonts w:ascii="Tahoma" w:eastAsia="Cambria" w:hAnsi="Tahoma" w:cs="Tahoma"/>
-              <w:color w:val="808080"/>
-              <w:sz w:val="16"/>
-              <w:szCs w:val="16"/>
-            </w:rPr>
-            <w:t>Click here to enter text.</w:t>
-          </w:r>
-        </w:p>
-      </w:docPartBody>
-    </w:docPart>
   </w:docParts>
 </w:glossaryDocument>
 </file>
@@ -7886,10 +7872,12 @@
     <w:rsid w:val="000C33B6"/>
     <w:rsid w:val="000D0C5E"/>
     <w:rsid w:val="000E7FBA"/>
+    <w:rsid w:val="001A73EA"/>
     <w:rsid w:val="001A74DB"/>
     <w:rsid w:val="001E57AD"/>
     <w:rsid w:val="00265F7E"/>
     <w:rsid w:val="00281C34"/>
+    <w:rsid w:val="002868E9"/>
     <w:rsid w:val="00295AC9"/>
     <w:rsid w:val="002A1C32"/>
     <w:rsid w:val="00301A37"/>
@@ -7947,6 +7935,7 @@
     <w:rsid w:val="00E832A6"/>
     <w:rsid w:val="00EA0548"/>
     <w:rsid w:val="00ED7D11"/>
+    <w:rsid w:val="00F1575F"/>
     <w:rsid w:val="00F72056"/>
     <w:rsid w:val="00F75CDB"/>
     <w:rsid w:val="00F76A54"/>
@@ -8769,14 +8758,6 @@
 </file>
 
 <file path=customXml/item1.xml><?xml version="1.0" encoding="utf-8"?>
-<Session xmlns="http://schemas.business-integrity.com/dealbuilder/2006/answers"/>
-</file>
-
-<file path=customXml/item2.xml><?xml version="1.0" encoding="utf-8"?>
-<Dictionary xmlns="http://schemas.business-integrity.com/dealbuilder/2006/dictionary" SavedByVersion="10.15.67.1" MinimumVersion="7.2.0.0"/>
-</file>
-
-<file path=customXml/item3.xml><?xml version="1.0" encoding="utf-8"?>
 <p:properties xmlns:p="http://schemas.microsoft.com/office/2006/metadata/properties" xmlns:xsi="http://www.w3.org/2001/XMLSchema-instance" xmlns:pc="http://schemas.microsoft.com/office/infopath/2007/PartnerControls">
   <documentManagement>
     <lcf76f155ced4ddcb4097134ff3c332f xmlns="d9c60541-b97e-4531-bd5d-c95af8ba043f">
@@ -8787,7 +8768,24 @@
 </p:properties>
 </file>
 
+<file path=customXml/item2.xml><?xml version="1.0" encoding="utf-8"?>
+<Dictionary xmlns="http://schemas.business-integrity.com/dealbuilder/2006/dictionary" SavedByVersion="10.15.67.1" MinimumVersion="7.2.0.0"/>
+</file>
+
+<file path=customXml/item3.xml><?xml version="1.0" encoding="utf-8"?>
+<Session xmlns="http://schemas.business-integrity.com/dealbuilder/2006/answers"/>
+</file>
+
 <file path=customXml/item4.xml><?xml version="1.0" encoding="utf-8"?>
+<?mso-contentType ?>
+<FormTemplates xmlns="http://schemas.microsoft.com/sharepoint/v3/contenttype/forms">
+  <Display>DocumentLibraryForm</Display>
+  <Edit>DocumentLibraryForm</Edit>
+  <New>DocumentLibraryForm</New>
+</FormTemplates>
+</file>
+
+<file path=customXml/item5.xml><?xml version="1.0" encoding="utf-8"?>
 <ct:contentTypeSchema xmlns:ct="http://schemas.microsoft.com/office/2006/metadata/contentType" xmlns:ma="http://schemas.microsoft.com/office/2006/metadata/properties/metaAttributes" ct:_="" ma:_="" ma:contentTypeName="Document" ma:contentTypeID="0x0101001C9D4C717E432B45829341C6EB4E0512" ma:contentTypeVersion="13" ma:contentTypeDescription="Create a new document." ma:contentTypeScope="" ma:versionID="7b087f34b0bb847110e4c2aaa6404b0d">
   <xsd:schema xmlns:xsd="http://www.w3.org/2001/XMLSchema" xmlns:xs="http://www.w3.org/2001/XMLSchema" xmlns:p="http://schemas.microsoft.com/office/2006/metadata/properties" xmlns:ns2="d9c60541-b97e-4531-bd5d-c95af8ba043f" xmlns:ns3="2298e316-5395-4ea8-8620-f0b006294e0b" targetNamespace="http://schemas.microsoft.com/office/2006/metadata/properties" ma:root="true" ma:fieldsID="5ad2acb738f07d01074449fb9ab80a03" ns2:_="" ns3:_="">
     <xsd:import namespace="d9c60541-b97e-4531-bd5d-c95af8ba043f"/>
@@ -8994,19 +8992,13 @@
 </ct:contentTypeSchema>
 </file>
 
-<file path=customXml/item5.xml><?xml version="1.0" encoding="utf-8"?>
-<?mso-contentType ?>
-<FormTemplates xmlns="http://schemas.microsoft.com/sharepoint/v3/contenttype/forms">
-  <Display>DocumentLibraryForm</Display>
-  <Edit>DocumentLibraryForm</Edit>
-  <New>DocumentLibraryForm</New>
-</FormTemplates>
-</file>
-
 <file path=customXml/itemProps1.xml><?xml version="1.0" encoding="utf-8"?>
-<ds:datastoreItem xmlns:ds="http://schemas.openxmlformats.org/officeDocument/2006/customXml" ds:itemID="{B17D58BB-A77C-4368-A0BC-DEE26B6B6221}">
+<ds:datastoreItem xmlns:ds="http://schemas.openxmlformats.org/officeDocument/2006/customXml" ds:itemID="{929CE202-2D19-40A4-A251-1D47D9450DC6}">
   <ds:schemaRefs>
-    <ds:schemaRef ds:uri="http://schemas.business-integrity.com/dealbuilder/2006/answers"/>
+    <ds:schemaRef ds:uri="http://schemas.microsoft.com/office/2006/metadata/properties"/>
+    <ds:schemaRef ds:uri="http://schemas.microsoft.com/office/infopath/2007/PartnerControls"/>
+    <ds:schemaRef ds:uri="d9c60541-b97e-4531-bd5d-c95af8ba043f"/>
+    <ds:schemaRef ds:uri="2298e316-5395-4ea8-8620-f0b006294e0b"/>
   </ds:schemaRefs>
 </ds:datastoreItem>
 </file>
@@ -9020,17 +9012,22 @@
 </file>
 
 <file path=customXml/itemProps3.xml><?xml version="1.0" encoding="utf-8"?>
-<ds:datastoreItem xmlns:ds="http://schemas.openxmlformats.org/officeDocument/2006/customXml" ds:itemID="{929CE202-2D19-40A4-A251-1D47D9450DC6}">
+<ds:datastoreItem xmlns:ds="http://schemas.openxmlformats.org/officeDocument/2006/customXml" ds:itemID="{B17D58BB-A77C-4368-A0BC-DEE26B6B6221}">
   <ds:schemaRefs>
-    <ds:schemaRef ds:uri="http://schemas.microsoft.com/office/2006/metadata/properties"/>
-    <ds:schemaRef ds:uri="http://schemas.microsoft.com/office/infopath/2007/PartnerControls"/>
-    <ds:schemaRef ds:uri="d9c60541-b97e-4531-bd5d-c95af8ba043f"/>
-    <ds:schemaRef ds:uri="2298e316-5395-4ea8-8620-f0b006294e0b"/>
+    <ds:schemaRef ds:uri="http://schemas.business-integrity.com/dealbuilder/2006/answers"/>
   </ds:schemaRefs>
 </ds:datastoreItem>
 </file>
 
 <file path=customXml/itemProps4.xml><?xml version="1.0" encoding="utf-8"?>
+<ds:datastoreItem xmlns:ds="http://schemas.openxmlformats.org/officeDocument/2006/customXml" ds:itemID="{C92DB59C-A80D-4402-A564-50EA110A9AE6}">
+  <ds:schemaRefs>
+    <ds:schemaRef ds:uri="http://schemas.microsoft.com/sharepoint/v3/contenttype/forms"/>
+  </ds:schemaRefs>
+</ds:datastoreItem>
+</file>
+
+<file path=customXml/itemProps5.xml><?xml version="1.0" encoding="utf-8"?>
 <ds:datastoreItem xmlns:ds="http://schemas.openxmlformats.org/officeDocument/2006/customXml" ds:itemID="{6EEAB147-0A35-45A3-8D92-DFB5407796DE}">
   <ds:schemaRefs>
     <ds:schemaRef ds:uri="http://schemas.microsoft.com/office/2006/metadata/contentType"/>
@@ -9047,12 +9044,4 @@
     <ds:schemaRef ds:uri="http://schemas.microsoft.com/internal/obd"/>
   </ds:schemaRefs>
 </ds:datastoreItem>
-</file>
-
-<file path=customXml/itemProps5.xml><?xml version="1.0" encoding="utf-8"?>
-<ds:datastoreItem xmlns:ds="http://schemas.openxmlformats.org/officeDocument/2006/customXml" ds:itemID="{C92DB59C-A80D-4402-A564-50EA110A9AE6}">
-  <ds:schemaRefs>
-    <ds:schemaRef ds:uri="http://schemas.microsoft.com/sharepoint/v3/contenttype/forms"/>
-  </ds:schemaRefs>
-</ds:datastoreItem>
 </file>
</xml_diff>